<commit_message>
Phase 1 accuracy: rules layer, spacing-tolerant matching, empty-reply guard, corrected answer key; findings v1 renamed, v2 added
Co-Authored-By: Claude Sonnet 5.5 <noreply@anthropic.com>
</commit_message>
<xml_diff>
--- a/tests/TestCorpus/docx/01-hr-letter.docx
+++ b/tests/TestCorpus/docx/01-hr-letter.docx
@@ -105,7 +105,13 @@
     </w:p>
     <w:p>
       <w:r>
-        <w:t xml:space="preserve">Your new salary will be paid into the account ending 4821. If any of these details are wrong, please call me on </w:t>
+        <w:t xml:space="preserve">Your new salary will be paid into the account ending </w:t>
+      </w:r>
+      <w:r>
+        <w:t xml:space="preserve">4821</w:t>
+      </w:r>
+      <w:r>
+        <w:t xml:space="preserve">. If any of these details are wrong, please call me on </w:t>
       </w:r>
       <w:r>
         <w:t xml:space="preserve">07700 900123</w:t>

</xml_diff>